<commit_message>
Relabel Gallup scope as vessel inspection in 2026-08-12 report
Co-Authored-By: Claude Fable 5 <noreply@anthropic.com>
Claude-Session: https://claude.ai/code/session_019UGpM3ZDPErkHojPtkGGy9
</commit_message>
<xml_diff>
--- a/reports/Titan2_Daily_Report_2026-08-12.docx
+++ b/reports/Titan2_Daily_Report_2026-08-12.docx
@@ -310,7 +310,7 @@
           <w:sz w:val="21"/>
           <w:szCs w:val="21"/>
         </w:rPr>
-        <w:t xml:space="preserve">Gallup / fuel gas reroute: </w:t>
+        <w:t xml:space="preserve">Gallup / vessel inspection: </w:t>
       </w:r>
       <w:r>
         <w:rPr>
@@ -814,7 +814,7 @@
                 <w:sz w:val="19"/>
                 <w:szCs w:val="19"/>
               </w:rPr>
-              <w:t xml:space="preserve">Gallup fuel gas reroute — quote submitted; review it, confirm night-work start 08-24, and align Gallup manpower expectations given full-tower scaffolding.</w:t>
+              <w:t xml:space="preserve">Gallup vessel inspection — quote submitted; review it, confirm night-work start 08-24, and align Gallup manpower expectations given full-tower scaffolding.</w:t>
             </w:r>
           </w:p>
         </w:tc>
@@ -837,7 +837,7 @@
                 <w:sz w:val="19"/>
                 <w:szCs w:val="19"/>
               </w:rPr>
-              <w:t xml:space="preserve">Fuel Gas</w:t>
+              <w:t xml:space="preserve">Inspections</w:t>
             </w:r>
           </w:p>
         </w:tc>

</xml_diff>